<commit_message>
Day 3 perform SQL analysis to understand business KPI's and undestand customer behavior
</commit_message>
<xml_diff>
--- a/reports/daily_report.docx
+++ b/reports/daily_report.docx
@@ -1521,9 +1521,356 @@
         <w:pStyle w:val="Heading2"/>
       </w:pPr>
       <w:r>
-        <w:t>Day 3: What I Did:</w:t>
-      </w:r>
-    </w:p>
+        <w:t>Day 3: What I Di</w:t>
+      </w:r>
+      <w:r>
+        <w:t>d:</w:t>
+      </w:r>
+    </w:p>
+    <w:p>
+      <w:pPr>
+        <w:pStyle w:val="ListParagraph"/>
+        <w:numPr>
+          <w:ilvl w:val="0"/>
+          <w:numId w:val="14"/>
+        </w:numPr>
+      </w:pPr>
+      <w:r>
+        <w:t xml:space="preserve">I have </w:t>
+      </w:r>
+      <w:r>
+        <w:t>perform</w:t>
+      </w:r>
+      <w:r>
+        <w:t xml:space="preserve"> S</w:t>
+      </w:r>
+      <w:proofErr w:type="spellStart"/>
+      <w:r>
+        <w:t>Ql</w:t>
+      </w:r>
+      <w:proofErr w:type="spellEnd"/>
+      <w:r>
+        <w:t xml:space="preserve"> analysis of dataset </w:t>
+      </w:r>
+      <w:r>
+        <w:t xml:space="preserve">to identify business KPI’s and customer </w:t>
+      </w:r>
+      <w:proofErr w:type="gramStart"/>
+      <w:r>
+        <w:t xml:space="preserve">insights </w:t>
+      </w:r>
+      <w:r>
+        <w:t xml:space="preserve"> which</w:t>
+      </w:r>
+      <w:proofErr w:type="gramEnd"/>
+      <w:r>
+        <w:t xml:space="preserve"> are given below:</w:t>
+      </w:r>
+    </w:p>
+    <w:p>
+      <w:pPr>
+        <w:pStyle w:val="ListParagraph"/>
+        <w:numPr>
+          <w:ilvl w:val="0"/>
+          <w:numId w:val="15"/>
+        </w:numPr>
+      </w:pPr>
+      <w:r>
+        <w:t xml:space="preserve">Total revenue is </w:t>
+      </w:r>
+      <w:r>
+        <w:t>'16008872'</w:t>
+      </w:r>
+      <w:r>
+        <w:t>.</w:t>
+      </w:r>
+    </w:p>
+    <w:p>
+      <w:pPr>
+        <w:pStyle w:val="ListParagraph"/>
+        <w:numPr>
+          <w:ilvl w:val="0"/>
+          <w:numId w:val="15"/>
+        </w:numPr>
+      </w:pPr>
+      <w:r>
+        <w:t xml:space="preserve">Total orders </w:t>
+      </w:r>
+      <w:proofErr w:type="gramStart"/>
+      <w:r>
+        <w:t>is</w:t>
+      </w:r>
+      <w:proofErr w:type="gramEnd"/>
+      <w:r>
+        <w:t xml:space="preserve"> ‘99441’.</w:t>
+      </w:r>
+    </w:p>
+    <w:p>
+      <w:pPr>
+        <w:pStyle w:val="ListParagraph"/>
+        <w:numPr>
+          <w:ilvl w:val="0"/>
+          <w:numId w:val="15"/>
+        </w:numPr>
+      </w:pPr>
+      <w:r>
+        <w:t xml:space="preserve">Total customers </w:t>
+      </w:r>
+      <w:proofErr w:type="gramStart"/>
+      <w:r>
+        <w:t>is</w:t>
+      </w:r>
+      <w:proofErr w:type="gramEnd"/>
+      <w:r>
+        <w:t xml:space="preserve"> 96096.</w:t>
+      </w:r>
+    </w:p>
+    <w:p>
+      <w:pPr>
+        <w:pStyle w:val="ListParagraph"/>
+        <w:numPr>
+          <w:ilvl w:val="0"/>
+          <w:numId w:val="15"/>
+        </w:numPr>
+      </w:pPr>
+      <w:r>
+        <w:t>Top 5 customers by revenue</w:t>
+      </w:r>
+    </w:p>
+    <w:p>
+      <w:pPr>
+        <w:ind w:left="1080"/>
+      </w:pPr>
+      <w:r>
+        <w:rPr>
+          <w:noProof/>
+        </w:rPr>
+        <w:drawing>
+          <wp:inline distT="0" distB="0" distL="0" distR="0" wp14:anchorId="5981E09A" wp14:editId="66924ED5">
+            <wp:extent cx="5000625" cy="1057275"/>
+            <wp:effectExtent l="0" t="0" r="9525" b="9525"/>
+            <wp:docPr id="2" name="Picture 2"/>
+            <wp:cNvGraphicFramePr>
+              <a:graphicFrameLocks xmlns:a="http://schemas.openxmlformats.org/drawingml/2006/main" noChangeAspect="1"/>
+            </wp:cNvGraphicFramePr>
+            <a:graphic xmlns:a="http://schemas.openxmlformats.org/drawingml/2006/main">
+              <a:graphicData uri="http://schemas.openxmlformats.org/drawingml/2006/picture">
+                <pic:pic xmlns:pic="http://schemas.openxmlformats.org/drawingml/2006/picture">
+                  <pic:nvPicPr>
+                    <pic:cNvPr id="1" name=""/>
+                    <pic:cNvPicPr/>
+                  </pic:nvPicPr>
+                  <pic:blipFill>
+                    <a:blip r:embed="rId8"/>
+                    <a:stretch>
+                      <a:fillRect/>
+                    </a:stretch>
+                  </pic:blipFill>
+                  <pic:spPr>
+                    <a:xfrm>
+                      <a:off x="0" y="0"/>
+                      <a:ext cx="5000625" cy="1057275"/>
+                    </a:xfrm>
+                    <a:prstGeom prst="rect">
+                      <a:avLst/>
+                    </a:prstGeom>
+                  </pic:spPr>
+                </pic:pic>
+              </a:graphicData>
+            </a:graphic>
+          </wp:inline>
+        </w:drawing>
+      </w:r>
+    </w:p>
+    <w:p>
+      <w:pPr>
+        <w:pStyle w:val="ListParagraph"/>
+        <w:numPr>
+          <w:ilvl w:val="0"/>
+          <w:numId w:val="15"/>
+        </w:numPr>
+      </w:pPr>
+      <w:r>
+        <w:t>Monthly revenue</w:t>
+      </w:r>
+    </w:p>
+    <w:p>
+      <w:pPr>
+        <w:pStyle w:val="ListParagraph"/>
+        <w:ind w:left="1440"/>
+      </w:pPr>
+      <w:r>
+        <w:rPr>
+          <w:noProof/>
+        </w:rPr>
+        <w:drawing>
+          <wp:inline distT="0" distB="0" distL="0" distR="0" wp14:anchorId="19B21E61" wp14:editId="614437C4">
+            <wp:extent cx="1638300" cy="2219325"/>
+            <wp:effectExtent l="0" t="0" r="0" b="9525"/>
+            <wp:docPr id="4" name="Picture 4"/>
+            <wp:cNvGraphicFramePr>
+              <a:graphicFrameLocks xmlns:a="http://schemas.openxmlformats.org/drawingml/2006/main" noChangeAspect="1"/>
+            </wp:cNvGraphicFramePr>
+            <a:graphic xmlns:a="http://schemas.openxmlformats.org/drawingml/2006/main">
+              <a:graphicData uri="http://schemas.openxmlformats.org/drawingml/2006/picture">
+                <pic:pic xmlns:pic="http://schemas.openxmlformats.org/drawingml/2006/picture">
+                  <pic:nvPicPr>
+                    <pic:cNvPr id="1" name=""/>
+                    <pic:cNvPicPr/>
+                  </pic:nvPicPr>
+                  <pic:blipFill>
+                    <a:blip r:embed="rId9"/>
+                    <a:stretch>
+                      <a:fillRect/>
+                    </a:stretch>
+                  </pic:blipFill>
+                  <pic:spPr>
+                    <a:xfrm>
+                      <a:off x="0" y="0"/>
+                      <a:ext cx="1638300" cy="2219325"/>
+                    </a:xfrm>
+                    <a:prstGeom prst="rect">
+                      <a:avLst/>
+                    </a:prstGeom>
+                  </pic:spPr>
+                </pic:pic>
+              </a:graphicData>
+            </a:graphic>
+          </wp:inline>
+        </w:drawing>
+      </w:r>
+    </w:p>
+    <w:p>
+      <w:pPr>
+        <w:ind w:firstLine="720"/>
+      </w:pPr>
+      <w:r>
+        <w:lastRenderedPageBreak/>
+        <w:t>6.</w:t>
+      </w:r>
+      <w:r>
+        <w:t xml:space="preserve"> A</w:t>
+      </w:r>
+      <w:r>
+        <w:t>vg order value is 161.</w:t>
+      </w:r>
+    </w:p>
+    <w:p>
+      <w:pPr>
+        <w:ind w:firstLine="720"/>
+      </w:pPr>
+      <w:r>
+        <w:t>7.</w:t>
+      </w:r>
+      <w:r>
+        <w:t xml:space="preserve"> </w:t>
+      </w:r>
+      <w:r>
+        <w:t>Top performing category</w:t>
+      </w:r>
+    </w:p>
+    <w:p>
+      <w:pPr>
+        <w:ind w:firstLine="720"/>
+      </w:pPr>
+      <w:r>
+        <w:rPr>
+          <w:noProof/>
+        </w:rPr>
+        <w:drawing>
+          <wp:inline distT="0" distB="0" distL="0" distR="0" wp14:anchorId="278777E6" wp14:editId="130F808F">
+            <wp:extent cx="2095500" cy="1104900"/>
+            <wp:effectExtent l="0" t="0" r="0" b="0"/>
+            <wp:docPr id="5" name="Picture 5"/>
+            <wp:cNvGraphicFramePr>
+              <a:graphicFrameLocks xmlns:a="http://schemas.openxmlformats.org/drawingml/2006/main" noChangeAspect="1"/>
+            </wp:cNvGraphicFramePr>
+            <a:graphic xmlns:a="http://schemas.openxmlformats.org/drawingml/2006/main">
+              <a:graphicData uri="http://schemas.openxmlformats.org/drawingml/2006/picture">
+                <pic:pic xmlns:pic="http://schemas.openxmlformats.org/drawingml/2006/picture">
+                  <pic:nvPicPr>
+                    <pic:cNvPr id="1" name=""/>
+                    <pic:cNvPicPr/>
+                  </pic:nvPicPr>
+                  <pic:blipFill>
+                    <a:blip r:embed="rId10"/>
+                    <a:stretch>
+                      <a:fillRect/>
+                    </a:stretch>
+                  </pic:blipFill>
+                  <pic:spPr>
+                    <a:xfrm>
+                      <a:off x="0" y="0"/>
+                      <a:ext cx="2095500" cy="1104900"/>
+                    </a:xfrm>
+                    <a:prstGeom prst="rect">
+                      <a:avLst/>
+                    </a:prstGeom>
+                  </pic:spPr>
+                </pic:pic>
+              </a:graphicData>
+            </a:graphic>
+          </wp:inline>
+        </w:drawing>
+      </w:r>
+    </w:p>
+    <w:p>
+      <w:pPr>
+        <w:ind w:firstLine="720"/>
+      </w:pPr>
+      <w:r>
+        <w:t>8.</w:t>
+      </w:r>
+      <w:r>
+        <w:t xml:space="preserve"> Top States by order count</w:t>
+      </w:r>
+    </w:p>
+    <w:p>
+      <w:pPr>
+        <w:ind w:firstLine="720"/>
+      </w:pPr>
+      <w:r>
+        <w:rPr>
+          <w:noProof/>
+        </w:rPr>
+        <w:drawing>
+          <wp:inline distT="0" distB="0" distL="0" distR="0" wp14:anchorId="3982E0DB" wp14:editId="6CF9113D">
+            <wp:extent cx="1733550" cy="1228725"/>
+            <wp:effectExtent l="0" t="0" r="0" b="9525"/>
+            <wp:docPr id="6" name="Picture 6"/>
+            <wp:cNvGraphicFramePr>
+              <a:graphicFrameLocks xmlns:a="http://schemas.openxmlformats.org/drawingml/2006/main" noChangeAspect="1"/>
+            </wp:cNvGraphicFramePr>
+            <a:graphic xmlns:a="http://schemas.openxmlformats.org/drawingml/2006/main">
+              <a:graphicData uri="http://schemas.openxmlformats.org/drawingml/2006/picture">
+                <pic:pic xmlns:pic="http://schemas.openxmlformats.org/drawingml/2006/picture">
+                  <pic:nvPicPr>
+                    <pic:cNvPr id="1" name=""/>
+                    <pic:cNvPicPr/>
+                  </pic:nvPicPr>
+                  <pic:blipFill>
+                    <a:blip r:embed="rId11"/>
+                    <a:stretch>
+                      <a:fillRect/>
+                    </a:stretch>
+                  </pic:blipFill>
+                  <pic:spPr>
+                    <a:xfrm>
+                      <a:off x="0" y="0"/>
+                      <a:ext cx="1733550" cy="1228725"/>
+                    </a:xfrm>
+                    <a:prstGeom prst="rect">
+                      <a:avLst/>
+                    </a:prstGeom>
+                  </pic:spPr>
+                </pic:pic>
+              </a:graphicData>
+            </a:graphic>
+          </wp:inline>
+        </w:drawing>
+      </w:r>
+    </w:p>
+    <w:p/>
     <w:sectPr>
       <w:pgSz w:w="12240" w:h="15840"/>
       <w:pgMar w:top="1440" w:right="1440" w:bottom="1440" w:left="1440" w:header="720" w:footer="720" w:gutter="0"/>
@@ -1650,6 +1997,119 @@
     </w:lvl>
   </w:abstractNum>
   <w:abstractNum w:abstractNumId="1" w15:restartNumberingAfterBreak="0">
+    <w:nsid w:val="0B1E1C5B"/>
+    <w:multiLevelType w:val="hybridMultilevel"/>
+    <w:tmpl w:val="ED1E2CBA"/>
+    <w:lvl w:ilvl="0" w:tplc="04090001">
+      <w:start w:val="1"/>
+      <w:numFmt w:val="bullet"/>
+      <w:lvlText w:val=""/>
+      <w:lvlJc w:val="left"/>
+      <w:pPr>
+        <w:ind w:left="720" w:hanging="360"/>
+      </w:pPr>
+      <w:rPr>
+        <w:rFonts w:ascii="Symbol" w:hAnsi="Symbol" w:hint="default"/>
+      </w:rPr>
+    </w:lvl>
+    <w:lvl w:ilvl="1" w:tplc="04090003" w:tentative="1">
+      <w:start w:val="1"/>
+      <w:numFmt w:val="bullet"/>
+      <w:lvlText w:val="o"/>
+      <w:lvlJc w:val="left"/>
+      <w:pPr>
+        <w:ind w:left="1440" w:hanging="360"/>
+      </w:pPr>
+      <w:rPr>
+        <w:rFonts w:ascii="Courier New" w:hAnsi="Courier New" w:cs="Courier New" w:hint="default"/>
+      </w:rPr>
+    </w:lvl>
+    <w:lvl w:ilvl="2" w:tplc="04090005" w:tentative="1">
+      <w:start w:val="1"/>
+      <w:numFmt w:val="bullet"/>
+      <w:lvlText w:val=""/>
+      <w:lvlJc w:val="left"/>
+      <w:pPr>
+        <w:ind w:left="2160" w:hanging="360"/>
+      </w:pPr>
+      <w:rPr>
+        <w:rFonts w:ascii="Wingdings" w:hAnsi="Wingdings" w:hint="default"/>
+      </w:rPr>
+    </w:lvl>
+    <w:lvl w:ilvl="3" w:tplc="04090001" w:tentative="1">
+      <w:start w:val="1"/>
+      <w:numFmt w:val="bullet"/>
+      <w:lvlText w:val=""/>
+      <w:lvlJc w:val="left"/>
+      <w:pPr>
+        <w:ind w:left="2880" w:hanging="360"/>
+      </w:pPr>
+      <w:rPr>
+        <w:rFonts w:ascii="Symbol" w:hAnsi="Symbol" w:hint="default"/>
+      </w:rPr>
+    </w:lvl>
+    <w:lvl w:ilvl="4" w:tplc="04090003" w:tentative="1">
+      <w:start w:val="1"/>
+      <w:numFmt w:val="bullet"/>
+      <w:lvlText w:val="o"/>
+      <w:lvlJc w:val="left"/>
+      <w:pPr>
+        <w:ind w:left="3600" w:hanging="360"/>
+      </w:pPr>
+      <w:rPr>
+        <w:rFonts w:ascii="Courier New" w:hAnsi="Courier New" w:cs="Courier New" w:hint="default"/>
+      </w:rPr>
+    </w:lvl>
+    <w:lvl w:ilvl="5" w:tplc="04090005" w:tentative="1">
+      <w:start w:val="1"/>
+      <w:numFmt w:val="bullet"/>
+      <w:lvlText w:val=""/>
+      <w:lvlJc w:val="left"/>
+      <w:pPr>
+        <w:ind w:left="4320" w:hanging="360"/>
+      </w:pPr>
+      <w:rPr>
+        <w:rFonts w:ascii="Wingdings" w:hAnsi="Wingdings" w:hint="default"/>
+      </w:rPr>
+    </w:lvl>
+    <w:lvl w:ilvl="6" w:tplc="04090001" w:tentative="1">
+      <w:start w:val="1"/>
+      <w:numFmt w:val="bullet"/>
+      <w:lvlText w:val=""/>
+      <w:lvlJc w:val="left"/>
+      <w:pPr>
+        <w:ind w:left="5040" w:hanging="360"/>
+      </w:pPr>
+      <w:rPr>
+        <w:rFonts w:ascii="Symbol" w:hAnsi="Symbol" w:hint="default"/>
+      </w:rPr>
+    </w:lvl>
+    <w:lvl w:ilvl="7" w:tplc="04090003" w:tentative="1">
+      <w:start w:val="1"/>
+      <w:numFmt w:val="bullet"/>
+      <w:lvlText w:val="o"/>
+      <w:lvlJc w:val="left"/>
+      <w:pPr>
+        <w:ind w:left="5760" w:hanging="360"/>
+      </w:pPr>
+      <w:rPr>
+        <w:rFonts w:ascii="Courier New" w:hAnsi="Courier New" w:cs="Courier New" w:hint="default"/>
+      </w:rPr>
+    </w:lvl>
+    <w:lvl w:ilvl="8" w:tplc="04090005" w:tentative="1">
+      <w:start w:val="1"/>
+      <w:numFmt w:val="bullet"/>
+      <w:lvlText w:val=""/>
+      <w:lvlJc w:val="left"/>
+      <w:pPr>
+        <w:ind w:left="6480" w:hanging="360"/>
+      </w:pPr>
+      <w:rPr>
+        <w:rFonts w:ascii="Wingdings" w:hAnsi="Wingdings" w:hint="default"/>
+      </w:rPr>
+    </w:lvl>
+  </w:abstractNum>
+  <w:abstractNum w:abstractNumId="2" w15:restartNumberingAfterBreak="0">
     <w:nsid w:val="12FB5CB0"/>
     <w:multiLevelType w:val="hybridMultilevel"/>
     <w:tmpl w:val="3796FBE4"/>
@@ -1735,7 +2195,7 @@
       </w:pPr>
     </w:lvl>
   </w:abstractNum>
-  <w:abstractNum w:abstractNumId="2" w15:restartNumberingAfterBreak="0">
+  <w:abstractNum w:abstractNumId="3" w15:restartNumberingAfterBreak="0">
     <w:nsid w:val="1ABB264A"/>
     <w:multiLevelType w:val="hybridMultilevel"/>
     <w:tmpl w:val="A0A68BC4"/>
@@ -1824,7 +2284,7 @@
       </w:pPr>
     </w:lvl>
   </w:abstractNum>
-  <w:abstractNum w:abstractNumId="3" w15:restartNumberingAfterBreak="0">
+  <w:abstractNum w:abstractNumId="4" w15:restartNumberingAfterBreak="0">
     <w:nsid w:val="25672906"/>
     <w:multiLevelType w:val="multilevel"/>
     <w:tmpl w:val="17F2F06E"/>
@@ -1973,7 +2433,7 @@
       </w:rPr>
     </w:lvl>
   </w:abstractNum>
-  <w:abstractNum w:abstractNumId="4" w15:restartNumberingAfterBreak="0">
+  <w:abstractNum w:abstractNumId="5" w15:restartNumberingAfterBreak="0">
     <w:nsid w:val="2A7913BD"/>
     <w:multiLevelType w:val="hybridMultilevel"/>
     <w:tmpl w:val="CC36E5E6"/>
@@ -2086,7 +2546,7 @@
       </w:rPr>
     </w:lvl>
   </w:abstractNum>
-  <w:abstractNum w:abstractNumId="5" w15:restartNumberingAfterBreak="0">
+  <w:abstractNum w:abstractNumId="6" w15:restartNumberingAfterBreak="0">
     <w:nsid w:val="32A652B8"/>
     <w:multiLevelType w:val="multilevel"/>
     <w:tmpl w:val="587E7198"/>
@@ -2235,7 +2695,179 @@
       </w:rPr>
     </w:lvl>
   </w:abstractNum>
-  <w:abstractNum w:abstractNumId="6" w15:restartNumberingAfterBreak="0">
+  <w:abstractNum w:abstractNumId="7" w15:restartNumberingAfterBreak="0">
+    <w:nsid w:val="3BDB7530"/>
+    <w:multiLevelType w:val="hybridMultilevel"/>
+    <w:tmpl w:val="1CC4DE22"/>
+    <w:lvl w:ilvl="0" w:tplc="0409000F">
+      <w:start w:val="1"/>
+      <w:numFmt w:val="decimal"/>
+      <w:lvlText w:val="%1."/>
+      <w:lvlJc w:val="left"/>
+      <w:pPr>
+        <w:ind w:left="1800" w:hanging="360"/>
+      </w:pPr>
+    </w:lvl>
+    <w:lvl w:ilvl="1" w:tplc="04090019" w:tentative="1">
+      <w:start w:val="1"/>
+      <w:numFmt w:val="lowerLetter"/>
+      <w:lvlText w:val="%2."/>
+      <w:lvlJc w:val="left"/>
+      <w:pPr>
+        <w:ind w:left="2520" w:hanging="360"/>
+      </w:pPr>
+    </w:lvl>
+    <w:lvl w:ilvl="2" w:tplc="0409001B" w:tentative="1">
+      <w:start w:val="1"/>
+      <w:numFmt w:val="lowerRoman"/>
+      <w:lvlText w:val="%3."/>
+      <w:lvlJc w:val="right"/>
+      <w:pPr>
+        <w:ind w:left="3240" w:hanging="180"/>
+      </w:pPr>
+    </w:lvl>
+    <w:lvl w:ilvl="3" w:tplc="0409000F" w:tentative="1">
+      <w:start w:val="1"/>
+      <w:numFmt w:val="decimal"/>
+      <w:lvlText w:val="%4."/>
+      <w:lvlJc w:val="left"/>
+      <w:pPr>
+        <w:ind w:left="3960" w:hanging="360"/>
+      </w:pPr>
+    </w:lvl>
+    <w:lvl w:ilvl="4" w:tplc="04090019" w:tentative="1">
+      <w:start w:val="1"/>
+      <w:numFmt w:val="lowerLetter"/>
+      <w:lvlText w:val="%5."/>
+      <w:lvlJc w:val="left"/>
+      <w:pPr>
+        <w:ind w:left="4680" w:hanging="360"/>
+      </w:pPr>
+    </w:lvl>
+    <w:lvl w:ilvl="5" w:tplc="0409001B" w:tentative="1">
+      <w:start w:val="1"/>
+      <w:numFmt w:val="lowerRoman"/>
+      <w:lvlText w:val="%6."/>
+      <w:lvlJc w:val="right"/>
+      <w:pPr>
+        <w:ind w:left="5400" w:hanging="180"/>
+      </w:pPr>
+    </w:lvl>
+    <w:lvl w:ilvl="6" w:tplc="0409000F" w:tentative="1">
+      <w:start w:val="1"/>
+      <w:numFmt w:val="decimal"/>
+      <w:lvlText w:val="%7."/>
+      <w:lvlJc w:val="left"/>
+      <w:pPr>
+        <w:ind w:left="6120" w:hanging="360"/>
+      </w:pPr>
+    </w:lvl>
+    <w:lvl w:ilvl="7" w:tplc="04090019" w:tentative="1">
+      <w:start w:val="1"/>
+      <w:numFmt w:val="lowerLetter"/>
+      <w:lvlText w:val="%8."/>
+      <w:lvlJc w:val="left"/>
+      <w:pPr>
+        <w:ind w:left="6840" w:hanging="360"/>
+      </w:pPr>
+    </w:lvl>
+    <w:lvl w:ilvl="8" w:tplc="0409001B" w:tentative="1">
+      <w:start w:val="1"/>
+      <w:numFmt w:val="lowerRoman"/>
+      <w:lvlText w:val="%9."/>
+      <w:lvlJc w:val="right"/>
+      <w:pPr>
+        <w:ind w:left="7560" w:hanging="180"/>
+      </w:pPr>
+    </w:lvl>
+  </w:abstractNum>
+  <w:abstractNum w:abstractNumId="8" w15:restartNumberingAfterBreak="0">
+    <w:nsid w:val="45685D29"/>
+    <w:multiLevelType w:val="hybridMultilevel"/>
+    <w:tmpl w:val="81FAF58E"/>
+    <w:lvl w:ilvl="0" w:tplc="0409000F">
+      <w:start w:val="1"/>
+      <w:numFmt w:val="decimal"/>
+      <w:lvlText w:val="%1."/>
+      <w:lvlJc w:val="left"/>
+      <w:pPr>
+        <w:ind w:left="1440" w:hanging="360"/>
+      </w:pPr>
+    </w:lvl>
+    <w:lvl w:ilvl="1" w:tplc="04090019" w:tentative="1">
+      <w:start w:val="1"/>
+      <w:numFmt w:val="lowerLetter"/>
+      <w:lvlText w:val="%2."/>
+      <w:lvlJc w:val="left"/>
+      <w:pPr>
+        <w:ind w:left="2160" w:hanging="360"/>
+      </w:pPr>
+    </w:lvl>
+    <w:lvl w:ilvl="2" w:tplc="0409001B" w:tentative="1">
+      <w:start w:val="1"/>
+      <w:numFmt w:val="lowerRoman"/>
+      <w:lvlText w:val="%3."/>
+      <w:lvlJc w:val="right"/>
+      <w:pPr>
+        <w:ind w:left="2880" w:hanging="180"/>
+      </w:pPr>
+    </w:lvl>
+    <w:lvl w:ilvl="3" w:tplc="0409000F" w:tentative="1">
+      <w:start w:val="1"/>
+      <w:numFmt w:val="decimal"/>
+      <w:lvlText w:val="%4."/>
+      <w:lvlJc w:val="left"/>
+      <w:pPr>
+        <w:ind w:left="3600" w:hanging="360"/>
+      </w:pPr>
+    </w:lvl>
+    <w:lvl w:ilvl="4" w:tplc="04090019" w:tentative="1">
+      <w:start w:val="1"/>
+      <w:numFmt w:val="lowerLetter"/>
+      <w:lvlText w:val="%5."/>
+      <w:lvlJc w:val="left"/>
+      <w:pPr>
+        <w:ind w:left="4320" w:hanging="360"/>
+      </w:pPr>
+    </w:lvl>
+    <w:lvl w:ilvl="5" w:tplc="0409001B" w:tentative="1">
+      <w:start w:val="1"/>
+      <w:numFmt w:val="lowerRoman"/>
+      <w:lvlText w:val="%6."/>
+      <w:lvlJc w:val="right"/>
+      <w:pPr>
+        <w:ind w:left="5040" w:hanging="180"/>
+      </w:pPr>
+    </w:lvl>
+    <w:lvl w:ilvl="6" w:tplc="0409000F" w:tentative="1">
+      <w:start w:val="1"/>
+      <w:numFmt w:val="decimal"/>
+      <w:lvlText w:val="%7."/>
+      <w:lvlJc w:val="left"/>
+      <w:pPr>
+        <w:ind w:left="5760" w:hanging="360"/>
+      </w:pPr>
+    </w:lvl>
+    <w:lvl w:ilvl="7" w:tplc="04090019" w:tentative="1">
+      <w:start w:val="1"/>
+      <w:numFmt w:val="lowerLetter"/>
+      <w:lvlText w:val="%8."/>
+      <w:lvlJc w:val="left"/>
+      <w:pPr>
+        <w:ind w:left="6480" w:hanging="360"/>
+      </w:pPr>
+    </w:lvl>
+    <w:lvl w:ilvl="8" w:tplc="0409001B" w:tentative="1">
+      <w:start w:val="1"/>
+      <w:numFmt w:val="lowerRoman"/>
+      <w:lvlText w:val="%9."/>
+      <w:lvlJc w:val="right"/>
+      <w:pPr>
+        <w:ind w:left="7200" w:hanging="180"/>
+      </w:pPr>
+    </w:lvl>
+  </w:abstractNum>
+  <w:abstractNum w:abstractNumId="9" w15:restartNumberingAfterBreak="0">
     <w:nsid w:val="4B6A601F"/>
     <w:multiLevelType w:val="hybridMultilevel"/>
     <w:tmpl w:val="7FAEAE22"/>
@@ -2348,7 +2980,7 @@
       </w:rPr>
     </w:lvl>
   </w:abstractNum>
-  <w:abstractNum w:abstractNumId="7" w15:restartNumberingAfterBreak="0">
+  <w:abstractNum w:abstractNumId="10" w15:restartNumberingAfterBreak="0">
     <w:nsid w:val="52112DE4"/>
     <w:multiLevelType w:val="hybridMultilevel"/>
     <w:tmpl w:val="904EA3A6"/>
@@ -2461,7 +3093,7 @@
       </w:rPr>
     </w:lvl>
   </w:abstractNum>
-  <w:abstractNum w:abstractNumId="8" w15:restartNumberingAfterBreak="0">
+  <w:abstractNum w:abstractNumId="11" w15:restartNumberingAfterBreak="0">
     <w:nsid w:val="5AF770AF"/>
     <w:multiLevelType w:val="hybridMultilevel"/>
     <w:tmpl w:val="6CA0D96E"/>
@@ -2574,7 +3206,7 @@
       </w:rPr>
     </w:lvl>
   </w:abstractNum>
-  <w:abstractNum w:abstractNumId="9" w15:restartNumberingAfterBreak="0">
+  <w:abstractNum w:abstractNumId="12" w15:restartNumberingAfterBreak="0">
     <w:nsid w:val="652468BC"/>
     <w:multiLevelType w:val="hybridMultilevel"/>
     <w:tmpl w:val="7E82AA46"/>
@@ -2687,7 +3319,7 @@
       </w:rPr>
     </w:lvl>
   </w:abstractNum>
-  <w:abstractNum w:abstractNumId="10" w15:restartNumberingAfterBreak="0">
+  <w:abstractNum w:abstractNumId="13" w15:restartNumberingAfterBreak="0">
     <w:nsid w:val="73671137"/>
     <w:multiLevelType w:val="hybridMultilevel"/>
     <w:tmpl w:val="5198C30C"/>
@@ -2773,7 +3405,7 @@
       </w:pPr>
     </w:lvl>
   </w:abstractNum>
-  <w:abstractNum w:abstractNumId="11" w15:restartNumberingAfterBreak="0">
+  <w:abstractNum w:abstractNumId="14" w15:restartNumberingAfterBreak="0">
     <w:nsid w:val="74D85E35"/>
     <w:multiLevelType w:val="hybridMultilevel"/>
     <w:tmpl w:val="C3868154"/>
@@ -2859,7 +3491,7 @@
       </w:pPr>
     </w:lvl>
   </w:abstractNum>
-  <w:abstractNum w:abstractNumId="12" w15:restartNumberingAfterBreak="0">
+  <w:abstractNum w:abstractNumId="15" w15:restartNumberingAfterBreak="0">
     <w:nsid w:val="7AF72157"/>
     <w:multiLevelType w:val="multilevel"/>
     <w:tmpl w:val="9AD68A1E"/>
@@ -3009,43 +3641,52 @@
     </w:lvl>
   </w:abstractNum>
   <w:num w:numId="1" w16cid:durableId="1412697680">
-    <w:abstractNumId w:val="6"/>
+    <w:abstractNumId w:val="9"/>
   </w:num>
   <w:num w:numId="2" w16cid:durableId="877278279">
-    <w:abstractNumId w:val="7"/>
+    <w:abstractNumId w:val="10"/>
   </w:num>
   <w:num w:numId="3" w16cid:durableId="152066312">
-    <w:abstractNumId w:val="2"/>
+    <w:abstractNumId w:val="3"/>
   </w:num>
   <w:num w:numId="4" w16cid:durableId="551574881">
-    <w:abstractNumId w:val="4"/>
+    <w:abstractNumId w:val="5"/>
   </w:num>
   <w:num w:numId="5" w16cid:durableId="1330718531">
-    <w:abstractNumId w:val="9"/>
+    <w:abstractNumId w:val="12"/>
   </w:num>
   <w:num w:numId="6" w16cid:durableId="644358138">
     <w:abstractNumId w:val="0"/>
   </w:num>
   <w:num w:numId="7" w16cid:durableId="1087267074">
+    <w:abstractNumId w:val="11"/>
+  </w:num>
+  <w:num w:numId="8" w16cid:durableId="427391322">
+    <w:abstractNumId w:val="4"/>
+  </w:num>
+  <w:num w:numId="9" w16cid:durableId="891228874">
+    <w:abstractNumId w:val="6"/>
+  </w:num>
+  <w:num w:numId="10" w16cid:durableId="448620981">
+    <w:abstractNumId w:val="15"/>
+  </w:num>
+  <w:num w:numId="11" w16cid:durableId="1894928328">
+    <w:abstractNumId w:val="13"/>
+  </w:num>
+  <w:num w:numId="12" w16cid:durableId="937837565">
+    <w:abstractNumId w:val="14"/>
+  </w:num>
+  <w:num w:numId="13" w16cid:durableId="204948047">
+    <w:abstractNumId w:val="2"/>
+  </w:num>
+  <w:num w:numId="14" w16cid:durableId="760686047">
+    <w:abstractNumId w:val="1"/>
+  </w:num>
+  <w:num w:numId="15" w16cid:durableId="82340355">
     <w:abstractNumId w:val="8"/>
   </w:num>
-  <w:num w:numId="8" w16cid:durableId="427391322">
-    <w:abstractNumId w:val="3"/>
-  </w:num>
-  <w:num w:numId="9" w16cid:durableId="891228874">
-    <w:abstractNumId w:val="5"/>
-  </w:num>
-  <w:num w:numId="10" w16cid:durableId="448620981">
-    <w:abstractNumId w:val="12"/>
-  </w:num>
-  <w:num w:numId="11" w16cid:durableId="1894928328">
-    <w:abstractNumId w:val="10"/>
-  </w:num>
-  <w:num w:numId="12" w16cid:durableId="937837565">
-    <w:abstractNumId w:val="11"/>
-  </w:num>
-  <w:num w:numId="13" w16cid:durableId="204948047">
-    <w:abstractNumId w:val="1"/>
+  <w:num w:numId="16" w16cid:durableId="39405473">
+    <w:abstractNumId w:val="7"/>
   </w:num>
 </w:numbering>
 </file>
@@ -3651,6 +4292,7 @@
   <w:style w:type="character" w:default="1" w:styleId="DefaultParagraphFont">
     <w:name w:val="Default Paragraph Font"/>
     <w:uiPriority w:val="1"/>
+    <w:semiHidden/>
     <w:unhideWhenUsed/>
   </w:style>
   <w:style w:type="table" w:default="1" w:styleId="TableNormal">

</xml_diff>

<commit_message>
Perform RFM and Customer Segmentation
</commit_message>
<xml_diff>
--- a/reports/daily_report.docx
+++ b/reports/daily_report.docx
@@ -540,131 +540,25 @@
         <w:rPr>
           <w:color w:val="auto"/>
         </w:rPr>
-        <w:t xml:space="preserve">columns </w:t>
-      </w:r>
-      <w:proofErr w:type="spellStart"/>
+        <w:t>columns order_id, customer_id, order_status,</w:t>
+      </w:r>
       <w:r>
         <w:rPr>
           <w:color w:val="auto"/>
         </w:rPr>
-        <w:t>order_id</w:t>
-      </w:r>
-      <w:proofErr w:type="spellEnd"/>
+        <w:t xml:space="preserve"> order_purchase_timestamp, order_approved_at, order_delivered</w:t>
+      </w:r>
       <w:r>
         <w:rPr>
           <w:color w:val="auto"/>
         </w:rPr>
-        <w:t xml:space="preserve">, </w:t>
-      </w:r>
-      <w:proofErr w:type="spellStart"/>
+        <w:t xml:space="preserve">_carrier_date, order_delivered_customers_date, </w:t>
+      </w:r>
       <w:r>
         <w:rPr>
           <w:color w:val="auto"/>
         </w:rPr>
-        <w:t>customer_id</w:t>
-      </w:r>
-      <w:proofErr w:type="spellEnd"/>
-      <w:r>
-        <w:rPr>
-          <w:color w:val="auto"/>
-        </w:rPr>
-        <w:t xml:space="preserve">, </w:t>
-      </w:r>
-      <w:proofErr w:type="spellStart"/>
-      <w:r>
-        <w:rPr>
-          <w:color w:val="auto"/>
-        </w:rPr>
-        <w:t>order_status</w:t>
-      </w:r>
-      <w:proofErr w:type="spellEnd"/>
-      <w:r>
-        <w:rPr>
-          <w:color w:val="auto"/>
-        </w:rPr>
-        <w:t>,</w:t>
-      </w:r>
-      <w:r>
-        <w:rPr>
-          <w:color w:val="auto"/>
-        </w:rPr>
-        <w:t xml:space="preserve"> </w:t>
-      </w:r>
-      <w:proofErr w:type="spellStart"/>
-      <w:r>
-        <w:rPr>
-          <w:color w:val="auto"/>
-        </w:rPr>
-        <w:t>order_purchase_timestamp</w:t>
-      </w:r>
-      <w:proofErr w:type="spellEnd"/>
-      <w:r>
-        <w:rPr>
-          <w:color w:val="auto"/>
-        </w:rPr>
-        <w:t xml:space="preserve">, </w:t>
-      </w:r>
-      <w:proofErr w:type="spellStart"/>
-      <w:r>
-        <w:rPr>
-          <w:color w:val="auto"/>
-        </w:rPr>
-        <w:t>order_approved_at</w:t>
-      </w:r>
-      <w:proofErr w:type="spellEnd"/>
-      <w:r>
-        <w:rPr>
-          <w:color w:val="auto"/>
-        </w:rPr>
-        <w:t xml:space="preserve">, </w:t>
-      </w:r>
-      <w:proofErr w:type="spellStart"/>
-      <w:r>
-        <w:rPr>
-          <w:color w:val="auto"/>
-        </w:rPr>
-        <w:t>order_delivered</w:t>
-      </w:r>
-      <w:r>
-        <w:rPr>
-          <w:color w:val="auto"/>
-        </w:rPr>
-        <w:t>_carrier_date</w:t>
-      </w:r>
-      <w:proofErr w:type="spellEnd"/>
-      <w:r>
-        <w:rPr>
-          <w:color w:val="auto"/>
-        </w:rPr>
-        <w:t xml:space="preserve">, </w:t>
-      </w:r>
-      <w:proofErr w:type="spellStart"/>
-      <w:r>
-        <w:rPr>
-          <w:color w:val="auto"/>
-        </w:rPr>
-        <w:t>order_delivered_customers_date</w:t>
-      </w:r>
-      <w:proofErr w:type="spellEnd"/>
-      <w:r>
-        <w:rPr>
-          <w:color w:val="auto"/>
-        </w:rPr>
-        <w:t xml:space="preserve">, </w:t>
-      </w:r>
-      <w:proofErr w:type="spellStart"/>
-      <w:r>
-        <w:rPr>
-          <w:color w:val="auto"/>
-        </w:rPr>
-        <w:t>order_estimate_delivery_date</w:t>
-      </w:r>
-      <w:proofErr w:type="spellEnd"/>
-      <w:r>
-        <w:rPr>
-          <w:color w:val="auto"/>
-        </w:rPr>
-        <w:t>.</w:t>
+        <w:t>order_estimate_delivery_date.</w:t>
       </w:r>
     </w:p>
     <w:p>
@@ -684,318 +578,97 @@
           <w:sz w:val="24"/>
           <w:szCs w:val="24"/>
         </w:rPr>
-        <w:t xml:space="preserve">Olist_order_items_dataset.csv contains columns </w:t>
-      </w:r>
-      <w:proofErr w:type="spellStart"/>
+        <w:t>Olist_order_items_dataset.csv contains columns order_id, order_item_id, seller_id,</w:t>
+      </w:r>
       <w:r>
         <w:rPr>
           <w:sz w:val="24"/>
           <w:szCs w:val="24"/>
         </w:rPr>
-        <w:t>order_id</w:t>
-      </w:r>
-      <w:proofErr w:type="spellEnd"/>
-      <w:r>
+        <w:t xml:space="preserve"> shipping_limit_date, price, freight_value.</w:t>
+      </w:r>
+    </w:p>
+    <w:p>
+      <w:pPr>
+        <w:pStyle w:val="ListParagraph"/>
+        <w:numPr>
+          <w:ilvl w:val="0"/>
+          <w:numId w:val="4"/>
+        </w:numPr>
         <w:rPr>
           <w:sz w:val="24"/>
           <w:szCs w:val="24"/>
         </w:rPr>
-        <w:t xml:space="preserve">, </w:t>
-      </w:r>
-      <w:proofErr w:type="spellStart"/>
+      </w:pPr>
       <w:r>
         <w:rPr>
           <w:sz w:val="24"/>
           <w:szCs w:val="24"/>
         </w:rPr>
-        <w:t>order_item_id</w:t>
-      </w:r>
-      <w:proofErr w:type="spellEnd"/>
+        <w:t>Olist_</w:t>
+      </w:r>
       <w:r>
         <w:rPr>
           <w:sz w:val="24"/>
           <w:szCs w:val="24"/>
         </w:rPr>
-        <w:t xml:space="preserve">, </w:t>
-      </w:r>
-      <w:proofErr w:type="spellStart"/>
+        <w:t>products_dataset contains columns product_id, product_category_name</w:t>
+      </w:r>
       <w:r>
         <w:rPr>
           <w:sz w:val="24"/>
           <w:szCs w:val="24"/>
         </w:rPr>
-        <w:t>seller_id</w:t>
-      </w:r>
-      <w:proofErr w:type="spellEnd"/>
+        <w:t xml:space="preserve">, product_name_lenght, </w:t>
+      </w:r>
       <w:r>
         <w:rPr>
           <w:sz w:val="24"/>
           <w:szCs w:val="24"/>
         </w:rPr>
-        <w:t>,</w:t>
+        <w:t>product_description_lenght, product_photos_qyt,</w:t>
       </w:r>
       <w:r>
         <w:rPr>
           <w:sz w:val="24"/>
           <w:szCs w:val="24"/>
         </w:rPr>
-        <w:t xml:space="preserve"> </w:t>
-      </w:r>
-      <w:proofErr w:type="spellStart"/>
+        <w:t xml:space="preserve"> product_weight_g, product_lenght_cm, product_height_cm</w:t>
+      </w:r>
       <w:r>
         <w:rPr>
           <w:sz w:val="24"/>
           <w:szCs w:val="24"/>
         </w:rPr>
-        <w:t>shipping_limit_date</w:t>
-      </w:r>
-      <w:proofErr w:type="spellEnd"/>
-      <w:r>
+        <w:t>, product_width_cm.</w:t>
+      </w:r>
+    </w:p>
+    <w:p>
+      <w:pPr>
+        <w:pStyle w:val="ListParagraph"/>
+        <w:numPr>
+          <w:ilvl w:val="0"/>
+          <w:numId w:val="4"/>
+        </w:numPr>
         <w:rPr>
           <w:sz w:val="24"/>
           <w:szCs w:val="24"/>
         </w:rPr>
-        <w:t xml:space="preserve">, price, </w:t>
-      </w:r>
-      <w:proofErr w:type="spellStart"/>
+      </w:pPr>
       <w:r>
         <w:rPr>
           <w:sz w:val="24"/>
           <w:szCs w:val="24"/>
         </w:rPr>
-        <w:t>freight_value</w:t>
-      </w:r>
-      <w:proofErr w:type="spellEnd"/>
-      <w:r>
+        <w:t xml:space="preserve">Olist_customer_dataset contains columns </w:t>
+      </w:r>
+    </w:p>
+    <w:p>
+      <w:pPr>
         <w:rPr>
           <w:sz w:val="24"/>
           <w:szCs w:val="24"/>
         </w:rPr>
-        <w:t>.</w:t>
-      </w:r>
-    </w:p>
-    <w:p>
-      <w:pPr>
-        <w:pStyle w:val="ListParagraph"/>
-        <w:numPr>
-          <w:ilvl w:val="0"/>
-          <w:numId w:val="4"/>
-        </w:numPr>
-        <w:rPr>
-          <w:sz w:val="24"/>
-          <w:szCs w:val="24"/>
-        </w:rPr>
-      </w:pPr>
-      <w:proofErr w:type="spellStart"/>
-      <w:r>
-        <w:rPr>
-          <w:sz w:val="24"/>
-          <w:szCs w:val="24"/>
-        </w:rPr>
-        <w:t>Olist_</w:t>
-      </w:r>
-      <w:r>
-        <w:rPr>
-          <w:sz w:val="24"/>
-          <w:szCs w:val="24"/>
-        </w:rPr>
-        <w:t>products_dataset</w:t>
-      </w:r>
-      <w:proofErr w:type="spellEnd"/>
-      <w:r>
-        <w:rPr>
-          <w:sz w:val="24"/>
-          <w:szCs w:val="24"/>
-        </w:rPr>
-        <w:t xml:space="preserve"> contains columns </w:t>
-      </w:r>
-      <w:proofErr w:type="spellStart"/>
-      <w:r>
-        <w:rPr>
-          <w:sz w:val="24"/>
-          <w:szCs w:val="24"/>
-        </w:rPr>
-        <w:t>product_id</w:t>
-      </w:r>
-      <w:proofErr w:type="spellEnd"/>
-      <w:r>
-        <w:rPr>
-          <w:sz w:val="24"/>
-          <w:szCs w:val="24"/>
-        </w:rPr>
-        <w:t xml:space="preserve">, </w:t>
-      </w:r>
-      <w:proofErr w:type="spellStart"/>
-      <w:r>
-        <w:rPr>
-          <w:sz w:val="24"/>
-          <w:szCs w:val="24"/>
-        </w:rPr>
-        <w:t>product_category_name</w:t>
-      </w:r>
-      <w:proofErr w:type="spellEnd"/>
-      <w:r>
-        <w:rPr>
-          <w:sz w:val="24"/>
-          <w:szCs w:val="24"/>
-        </w:rPr>
-        <w:t xml:space="preserve">, </w:t>
-      </w:r>
-      <w:proofErr w:type="spellStart"/>
-      <w:r>
-        <w:rPr>
-          <w:sz w:val="24"/>
-          <w:szCs w:val="24"/>
-        </w:rPr>
-        <w:t>product_name_lenght</w:t>
-      </w:r>
-      <w:proofErr w:type="spellEnd"/>
-      <w:r>
-        <w:rPr>
-          <w:sz w:val="24"/>
-          <w:szCs w:val="24"/>
-        </w:rPr>
-        <w:t xml:space="preserve">, </w:t>
-      </w:r>
-      <w:proofErr w:type="spellStart"/>
-      <w:r>
-        <w:rPr>
-          <w:sz w:val="24"/>
-          <w:szCs w:val="24"/>
-        </w:rPr>
-        <w:t>product_description_lenght</w:t>
-      </w:r>
-      <w:proofErr w:type="spellEnd"/>
-      <w:r>
-        <w:rPr>
-          <w:sz w:val="24"/>
-          <w:szCs w:val="24"/>
-        </w:rPr>
-        <w:t xml:space="preserve">, </w:t>
-      </w:r>
-      <w:proofErr w:type="spellStart"/>
-      <w:r>
-        <w:rPr>
-          <w:sz w:val="24"/>
-          <w:szCs w:val="24"/>
-        </w:rPr>
-        <w:t>product_photos_qyt</w:t>
-      </w:r>
-      <w:proofErr w:type="spellEnd"/>
-      <w:r>
-        <w:rPr>
-          <w:sz w:val="24"/>
-          <w:szCs w:val="24"/>
-        </w:rPr>
-        <w:t>,</w:t>
-      </w:r>
-      <w:r>
-        <w:rPr>
-          <w:sz w:val="24"/>
-          <w:szCs w:val="24"/>
-        </w:rPr>
-        <w:t xml:space="preserve"> </w:t>
-      </w:r>
-      <w:proofErr w:type="spellStart"/>
-      <w:r>
-        <w:rPr>
-          <w:sz w:val="24"/>
-          <w:szCs w:val="24"/>
-        </w:rPr>
-        <w:t>product_weight_g</w:t>
-      </w:r>
-      <w:proofErr w:type="spellEnd"/>
-      <w:r>
-        <w:rPr>
-          <w:sz w:val="24"/>
-          <w:szCs w:val="24"/>
-        </w:rPr>
-        <w:t xml:space="preserve">, </w:t>
-      </w:r>
-      <w:proofErr w:type="spellStart"/>
-      <w:r>
-        <w:rPr>
-          <w:sz w:val="24"/>
-          <w:szCs w:val="24"/>
-        </w:rPr>
-        <w:t>product_lenght_cm</w:t>
-      </w:r>
-      <w:proofErr w:type="spellEnd"/>
-      <w:r>
-        <w:rPr>
-          <w:sz w:val="24"/>
-          <w:szCs w:val="24"/>
-        </w:rPr>
-        <w:t xml:space="preserve">, </w:t>
-      </w:r>
-      <w:proofErr w:type="spellStart"/>
-      <w:r>
-        <w:rPr>
-          <w:sz w:val="24"/>
-          <w:szCs w:val="24"/>
-        </w:rPr>
-        <w:t>product_height_cm</w:t>
-      </w:r>
-      <w:proofErr w:type="spellEnd"/>
-      <w:r>
-        <w:rPr>
-          <w:sz w:val="24"/>
-          <w:szCs w:val="24"/>
-        </w:rPr>
-        <w:t xml:space="preserve">, </w:t>
-      </w:r>
-      <w:proofErr w:type="spellStart"/>
-      <w:r>
-        <w:rPr>
-          <w:sz w:val="24"/>
-          <w:szCs w:val="24"/>
-        </w:rPr>
-        <w:t>product_width_cm</w:t>
-      </w:r>
-      <w:proofErr w:type="spellEnd"/>
-      <w:r>
-        <w:rPr>
-          <w:sz w:val="24"/>
-          <w:szCs w:val="24"/>
-        </w:rPr>
-        <w:t>.</w:t>
-      </w:r>
-    </w:p>
-    <w:p>
-      <w:pPr>
-        <w:pStyle w:val="ListParagraph"/>
-        <w:numPr>
-          <w:ilvl w:val="0"/>
-          <w:numId w:val="4"/>
-        </w:numPr>
-        <w:rPr>
-          <w:sz w:val="24"/>
-          <w:szCs w:val="24"/>
-        </w:rPr>
-      </w:pPr>
-      <w:proofErr w:type="spellStart"/>
-      <w:r>
-        <w:rPr>
-          <w:sz w:val="24"/>
-          <w:szCs w:val="24"/>
-        </w:rPr>
-        <w:t>Olist_customer_dataset</w:t>
-      </w:r>
-      <w:proofErr w:type="spellEnd"/>
-      <w:r>
-        <w:rPr>
-          <w:sz w:val="24"/>
-          <w:szCs w:val="24"/>
-        </w:rPr>
-        <w:t xml:space="preserve"> contains columns </w:t>
-      </w:r>
-    </w:p>
-    <w:p>
-      <w:pPr>
-        <w:rPr>
-          <w:sz w:val="24"/>
-          <w:szCs w:val="24"/>
-        </w:rPr>
       </w:pPr>
     </w:p>
     <w:p>
@@ -1018,15 +691,7 @@
         </w:numPr>
       </w:pPr>
       <w:r>
-        <w:t xml:space="preserve">Downloaded the </w:t>
-      </w:r>
-      <w:proofErr w:type="spellStart"/>
-      <w:r>
-        <w:t>Olist</w:t>
-      </w:r>
-      <w:proofErr w:type="spellEnd"/>
-      <w:r>
-        <w:t xml:space="preserve"> e-commerce dataset from Kaggle and extracted the files. </w:t>
+        <w:t xml:space="preserve">Downloaded the Olist e-commerce dataset from Kaggle and extracted the files. </w:t>
       </w:r>
     </w:p>
     <w:p>
@@ -1277,21 +942,12 @@
       <w:r>
         <w:t xml:space="preserve">Imported multiple datasets from the </w:t>
       </w:r>
-      <w:proofErr w:type="spellStart"/>
       <w:r>
         <w:rPr>
           <w:b/>
           <w:bCs/>
         </w:rPr>
-        <w:t>Olist</w:t>
-      </w:r>
-      <w:proofErr w:type="spellEnd"/>
-      <w:r>
-        <w:rPr>
-          <w:b/>
-          <w:bCs/>
-        </w:rPr>
-        <w:t xml:space="preserve"> E-commerce dataset</w:t>
+        <w:t>Olist E-commerce dataset</w:t>
       </w:r>
       <w:r>
         <w:t xml:space="preserve"> (stored locally), including: </w:t>
@@ -1342,13 +998,8 @@
           <w:numId w:val="11"/>
         </w:numPr>
       </w:pPr>
-      <w:proofErr w:type="spellStart"/>
-      <w:r>
-        <w:t>order_items</w:t>
-      </w:r>
-      <w:proofErr w:type="spellEnd"/>
-      <w:r>
-        <w:t xml:space="preserve"> </w:t>
+      <w:r>
+        <w:t xml:space="preserve">order_items </w:t>
       </w:r>
     </w:p>
     <w:p>
@@ -1383,13 +1034,8 @@
           <w:numId w:val="12"/>
         </w:numPr>
       </w:pPr>
-      <w:proofErr w:type="spellStart"/>
-      <w:r>
-        <w:t>customer_id</w:t>
-      </w:r>
-      <w:proofErr w:type="spellEnd"/>
-      <w:r>
-        <w:t xml:space="preserve"> (customers ↔ orders) </w:t>
+      <w:r>
+        <w:t xml:space="preserve">customer_id (customers ↔ orders) </w:t>
       </w:r>
     </w:p>
     <w:p>
@@ -1400,21 +1046,8 @@
           <w:numId w:val="12"/>
         </w:numPr>
       </w:pPr>
-      <w:proofErr w:type="spellStart"/>
-      <w:r>
-        <w:t>order_id</w:t>
-      </w:r>
-      <w:proofErr w:type="spellEnd"/>
-      <w:r>
-        <w:t xml:space="preserve"> (orders ↔ payments / </w:t>
-      </w:r>
-      <w:proofErr w:type="spellStart"/>
-      <w:r>
-        <w:t>order_items</w:t>
-      </w:r>
-      <w:proofErr w:type="spellEnd"/>
-      <w:r>
-        <w:t xml:space="preserve">) </w:t>
+      <w:r>
+        <w:t xml:space="preserve">order_id (orders ↔ payments / order_items) </w:t>
       </w:r>
     </w:p>
     <w:p>
@@ -1542,29 +1175,13 @@
         <w:t>perform</w:t>
       </w:r>
       <w:r>
-        <w:t xml:space="preserve"> S</w:t>
-      </w:r>
-      <w:proofErr w:type="spellStart"/>
-      <w:r>
-        <w:t>Ql</w:t>
-      </w:r>
-      <w:proofErr w:type="spellEnd"/>
-      <w:r>
-        <w:t xml:space="preserve"> analysis of dataset </w:t>
-      </w:r>
-      <w:r>
-        <w:t xml:space="preserve">to identify business KPI’s and customer </w:t>
-      </w:r>
-      <w:proofErr w:type="gramStart"/>
-      <w:r>
-        <w:t xml:space="preserve">insights </w:t>
-      </w:r>
-      <w:r>
-        <w:t xml:space="preserve"> which</w:t>
-      </w:r>
-      <w:proofErr w:type="gramEnd"/>
-      <w:r>
-        <w:t xml:space="preserve"> are given below:</w:t>
+        <w:t xml:space="preserve"> SQl analysis of dataset </w:t>
+      </w:r>
+      <w:r>
+        <w:t xml:space="preserve">to identify business KPI’s and customer insights </w:t>
+      </w:r>
+      <w:r>
+        <w:t xml:space="preserve"> which are given below:</w:t>
       </w:r>
     </w:p>
     <w:p>
@@ -1594,15 +1211,7 @@
         </w:numPr>
       </w:pPr>
       <w:r>
-        <w:t xml:space="preserve">Total orders </w:t>
-      </w:r>
-      <w:proofErr w:type="gramStart"/>
-      <w:r>
-        <w:t>is</w:t>
-      </w:r>
-      <w:proofErr w:type="gramEnd"/>
-      <w:r>
-        <w:t xml:space="preserve"> ‘99441’.</w:t>
+        <w:t>Total orders is ‘99441’.</w:t>
       </w:r>
     </w:p>
     <w:p>
@@ -1614,15 +1223,7 @@
         </w:numPr>
       </w:pPr>
       <w:r>
-        <w:t xml:space="preserve">Total customers </w:t>
-      </w:r>
-      <w:proofErr w:type="gramStart"/>
-      <w:r>
-        <w:t>is</w:t>
-      </w:r>
-      <w:proofErr w:type="gramEnd"/>
-      <w:r>
-        <w:t xml:space="preserve"> 96096.</w:t>
+        <w:t>Total customers is 96096.</w:t>
       </w:r>
     </w:p>
     <w:p>
@@ -1870,7 +1471,107 @@
         </w:drawing>
       </w:r>
     </w:p>
-    <w:p/>
+    <w:p>
+      <w:pPr>
+        <w:pStyle w:val="Heading2"/>
+        <w:rPr>
+          <w:color w:val="auto"/>
+        </w:rPr>
+      </w:pPr>
+      <w:r>
+        <w:t xml:space="preserve">Day 4 What I Did: </w:t>
+      </w:r>
+      <w:r>
+        <w:rPr>
+          <w:color w:val="auto"/>
+        </w:rPr>
+        <w:t>Perform RFM + Customer Segmentation</w:t>
+      </w:r>
+    </w:p>
+    <w:p>
+      <w:pPr>
+        <w:pStyle w:val="ListParagraph"/>
+        <w:numPr>
+          <w:ilvl w:val="0"/>
+          <w:numId w:val="14"/>
+        </w:numPr>
+      </w:pPr>
+      <w:r>
+        <w:t>Prepare data for perform RFM. RFM mean R for recency, F means frequency and M means monetary.</w:t>
+      </w:r>
+    </w:p>
+    <w:p>
+      <w:pPr>
+        <w:pStyle w:val="ListParagraph"/>
+        <w:numPr>
+          <w:ilvl w:val="0"/>
+          <w:numId w:val="14"/>
+        </w:numPr>
+      </w:pPr>
+      <w:r>
+        <w:t>Merge data (orders + customers) + payments.</w:t>
+      </w:r>
+    </w:p>
+    <w:p>
+      <w:pPr>
+        <w:pStyle w:val="ListParagraph"/>
+        <w:numPr>
+          <w:ilvl w:val="0"/>
+          <w:numId w:val="14"/>
+        </w:numPr>
+      </w:pPr>
+      <w:r>
+        <w:t>Create RFM table.</w:t>
+      </w:r>
+    </w:p>
+    <w:p>
+      <w:pPr>
+        <w:pStyle w:val="ListParagraph"/>
+        <w:numPr>
+          <w:ilvl w:val="0"/>
+          <w:numId w:val="14"/>
+        </w:numPr>
+      </w:pPr>
+      <w:r>
+        <w:t>Score customers.</w:t>
+      </w:r>
+    </w:p>
+    <w:p>
+      <w:pPr>
+        <w:pStyle w:val="ListParagraph"/>
+        <w:numPr>
+          <w:ilvl w:val="0"/>
+          <w:numId w:val="14"/>
+        </w:numPr>
+      </w:pPr>
+      <w:r>
+        <w:t>Create segments.</w:t>
+      </w:r>
+    </w:p>
+    <w:p>
+      <w:pPr>
+        <w:pStyle w:val="ListParagraph"/>
+        <w:numPr>
+          <w:ilvl w:val="0"/>
+          <w:numId w:val="14"/>
+        </w:numPr>
+      </w:pPr>
+      <w:r>
+        <w:t>Identify customer types.</w:t>
+      </w:r>
+    </w:p>
+    <w:p>
+      <w:pPr>
+        <w:pStyle w:val="ListParagraph"/>
+        <w:numPr>
+          <w:ilvl w:val="0"/>
+          <w:numId w:val="14"/>
+        </w:numPr>
+      </w:pPr>
+      <w:r>
+        <w:t>Create Visualization.</w:t>
+      </w:r>
+    </w:p>
     <w:sectPr>
       <w:pgSz w:w="12240" w:h="15840"/>
       <w:pgMar w:top="1440" w:right="1440" w:bottom="1440" w:left="1440" w:header="720" w:footer="720" w:gutter="0"/>
@@ -1999,7 +1700,7 @@
   <w:abstractNum w:abstractNumId="1" w15:restartNumberingAfterBreak="0">
     <w:nsid w:val="0B1E1C5B"/>
     <w:multiLevelType w:val="hybridMultilevel"/>
-    <w:tmpl w:val="ED1E2CBA"/>
+    <w:tmpl w:val="70AA9D1A"/>
     <w:lvl w:ilvl="0" w:tplc="04090001">
       <w:start w:val="1"/>
       <w:numFmt w:val="bullet"/>

</xml_diff>

<commit_message>
Updating report for final day
</commit_message>
<xml_diff>
--- a/reports/daily_report.docx
+++ b/reports/daily_report.docx
@@ -540,25 +540,131 @@
         <w:rPr>
           <w:color w:val="auto"/>
         </w:rPr>
-        <w:t>columns order_id, customer_id, order_status,</w:t>
-      </w:r>
+        <w:t xml:space="preserve">columns </w:t>
+      </w:r>
+      <w:proofErr w:type="spellStart"/>
       <w:r>
         <w:rPr>
           <w:color w:val="auto"/>
         </w:rPr>
-        <w:t xml:space="preserve"> order_purchase_timestamp, order_approved_at, order_delivered</w:t>
-      </w:r>
+        <w:t>order_id</w:t>
+      </w:r>
+      <w:proofErr w:type="spellEnd"/>
       <w:r>
         <w:rPr>
           <w:color w:val="auto"/>
         </w:rPr>
-        <w:t xml:space="preserve">_carrier_date, order_delivered_customers_date, </w:t>
-      </w:r>
+        <w:t xml:space="preserve">, </w:t>
+      </w:r>
+      <w:proofErr w:type="spellStart"/>
       <w:r>
         <w:rPr>
           <w:color w:val="auto"/>
         </w:rPr>
-        <w:t>order_estimate_delivery_date.</w:t>
+        <w:t>customer_id</w:t>
+      </w:r>
+      <w:proofErr w:type="spellEnd"/>
+      <w:r>
+        <w:rPr>
+          <w:color w:val="auto"/>
+        </w:rPr>
+        <w:t xml:space="preserve">, </w:t>
+      </w:r>
+      <w:proofErr w:type="spellStart"/>
+      <w:r>
+        <w:rPr>
+          <w:color w:val="auto"/>
+        </w:rPr>
+        <w:t>order_status</w:t>
+      </w:r>
+      <w:proofErr w:type="spellEnd"/>
+      <w:r>
+        <w:rPr>
+          <w:color w:val="auto"/>
+        </w:rPr>
+        <w:t>,</w:t>
+      </w:r>
+      <w:r>
+        <w:rPr>
+          <w:color w:val="auto"/>
+        </w:rPr>
+        <w:t xml:space="preserve"> </w:t>
+      </w:r>
+      <w:proofErr w:type="spellStart"/>
+      <w:r>
+        <w:rPr>
+          <w:color w:val="auto"/>
+        </w:rPr>
+        <w:t>order_purchase_timestamp</w:t>
+      </w:r>
+      <w:proofErr w:type="spellEnd"/>
+      <w:r>
+        <w:rPr>
+          <w:color w:val="auto"/>
+        </w:rPr>
+        <w:t xml:space="preserve">, </w:t>
+      </w:r>
+      <w:proofErr w:type="spellStart"/>
+      <w:r>
+        <w:rPr>
+          <w:color w:val="auto"/>
+        </w:rPr>
+        <w:t>order_approved_at</w:t>
+      </w:r>
+      <w:proofErr w:type="spellEnd"/>
+      <w:r>
+        <w:rPr>
+          <w:color w:val="auto"/>
+        </w:rPr>
+        <w:t xml:space="preserve">, </w:t>
+      </w:r>
+      <w:proofErr w:type="spellStart"/>
+      <w:r>
+        <w:rPr>
+          <w:color w:val="auto"/>
+        </w:rPr>
+        <w:t>order_delivered</w:t>
+      </w:r>
+      <w:r>
+        <w:rPr>
+          <w:color w:val="auto"/>
+        </w:rPr>
+        <w:t>_carrier_date</w:t>
+      </w:r>
+      <w:proofErr w:type="spellEnd"/>
+      <w:r>
+        <w:rPr>
+          <w:color w:val="auto"/>
+        </w:rPr>
+        <w:t xml:space="preserve">, </w:t>
+      </w:r>
+      <w:proofErr w:type="spellStart"/>
+      <w:r>
+        <w:rPr>
+          <w:color w:val="auto"/>
+        </w:rPr>
+        <w:t>order_delivered_customers_date</w:t>
+      </w:r>
+      <w:proofErr w:type="spellEnd"/>
+      <w:r>
+        <w:rPr>
+          <w:color w:val="auto"/>
+        </w:rPr>
+        <w:t xml:space="preserve">, </w:t>
+      </w:r>
+      <w:proofErr w:type="spellStart"/>
+      <w:r>
+        <w:rPr>
+          <w:color w:val="auto"/>
+        </w:rPr>
+        <w:t>order_estimate_delivery_date</w:t>
+      </w:r>
+      <w:proofErr w:type="spellEnd"/>
+      <w:r>
+        <w:rPr>
+          <w:color w:val="auto"/>
+        </w:rPr>
+        <w:t>.</w:t>
       </w:r>
     </w:p>
     <w:p>
@@ -578,97 +684,318 @@
           <w:sz w:val="24"/>
           <w:szCs w:val="24"/>
         </w:rPr>
-        <w:t>Olist_order_items_dataset.csv contains columns order_id, order_item_id, seller_id,</w:t>
-      </w:r>
+        <w:t xml:space="preserve">Olist_order_items_dataset.csv contains columns </w:t>
+      </w:r>
+      <w:proofErr w:type="spellStart"/>
       <w:r>
         <w:rPr>
           <w:sz w:val="24"/>
           <w:szCs w:val="24"/>
         </w:rPr>
-        <w:t xml:space="preserve"> shipping_limit_date, price, freight_value.</w:t>
-      </w:r>
-    </w:p>
-    <w:p>
-      <w:pPr>
-        <w:pStyle w:val="ListParagraph"/>
-        <w:numPr>
-          <w:ilvl w:val="0"/>
-          <w:numId w:val="4"/>
-        </w:numPr>
+        <w:t>order_id</w:t>
+      </w:r>
+      <w:proofErr w:type="spellEnd"/>
+      <w:r>
         <w:rPr>
           <w:sz w:val="24"/>
           <w:szCs w:val="24"/>
         </w:rPr>
-      </w:pPr>
+        <w:t xml:space="preserve">, </w:t>
+      </w:r>
+      <w:proofErr w:type="spellStart"/>
       <w:r>
         <w:rPr>
           <w:sz w:val="24"/>
           <w:szCs w:val="24"/>
         </w:rPr>
-        <w:t>Olist_</w:t>
-      </w:r>
+        <w:t>order_item_id</w:t>
+      </w:r>
+      <w:proofErr w:type="spellEnd"/>
       <w:r>
         <w:rPr>
           <w:sz w:val="24"/>
           <w:szCs w:val="24"/>
         </w:rPr>
-        <w:t>products_dataset contains columns product_id, product_category_name</w:t>
-      </w:r>
+        <w:t xml:space="preserve">, </w:t>
+      </w:r>
+      <w:proofErr w:type="spellStart"/>
       <w:r>
         <w:rPr>
           <w:sz w:val="24"/>
           <w:szCs w:val="24"/>
         </w:rPr>
-        <w:t xml:space="preserve">, product_name_lenght, </w:t>
-      </w:r>
+        <w:t>seller_id</w:t>
+      </w:r>
+      <w:proofErr w:type="spellEnd"/>
       <w:r>
         <w:rPr>
           <w:sz w:val="24"/>
           <w:szCs w:val="24"/>
         </w:rPr>
-        <w:t>product_description_lenght, product_photos_qyt,</w:t>
+        <w:t>,</w:t>
       </w:r>
       <w:r>
         <w:rPr>
           <w:sz w:val="24"/>
           <w:szCs w:val="24"/>
         </w:rPr>
-        <w:t xml:space="preserve"> product_weight_g, product_lenght_cm, product_height_cm</w:t>
-      </w:r>
+        <w:t xml:space="preserve"> </w:t>
+      </w:r>
+      <w:proofErr w:type="spellStart"/>
       <w:r>
         <w:rPr>
           <w:sz w:val="24"/>
           <w:szCs w:val="24"/>
         </w:rPr>
-        <w:t>, product_width_cm.</w:t>
-      </w:r>
-    </w:p>
-    <w:p>
-      <w:pPr>
-        <w:pStyle w:val="ListParagraph"/>
-        <w:numPr>
-          <w:ilvl w:val="0"/>
-          <w:numId w:val="4"/>
-        </w:numPr>
+        <w:t>shipping_limit_date</w:t>
+      </w:r>
+      <w:proofErr w:type="spellEnd"/>
+      <w:r>
         <w:rPr>
           <w:sz w:val="24"/>
           <w:szCs w:val="24"/>
         </w:rPr>
-      </w:pPr>
+        <w:t xml:space="preserve">, price, </w:t>
+      </w:r>
+      <w:proofErr w:type="spellStart"/>
       <w:r>
         <w:rPr>
           <w:sz w:val="24"/>
           <w:szCs w:val="24"/>
         </w:rPr>
-        <w:t xml:space="preserve">Olist_customer_dataset contains columns </w:t>
-      </w:r>
-    </w:p>
-    <w:p>
-      <w:pPr>
+        <w:t>freight_value</w:t>
+      </w:r>
+      <w:proofErr w:type="spellEnd"/>
+      <w:r>
         <w:rPr>
           <w:sz w:val="24"/>
           <w:szCs w:val="24"/>
         </w:rPr>
+        <w:t>.</w:t>
+      </w:r>
+    </w:p>
+    <w:p>
+      <w:pPr>
+        <w:pStyle w:val="ListParagraph"/>
+        <w:numPr>
+          <w:ilvl w:val="0"/>
+          <w:numId w:val="4"/>
+        </w:numPr>
+        <w:rPr>
+          <w:sz w:val="24"/>
+          <w:szCs w:val="24"/>
+        </w:rPr>
+      </w:pPr>
+      <w:proofErr w:type="spellStart"/>
+      <w:r>
+        <w:rPr>
+          <w:sz w:val="24"/>
+          <w:szCs w:val="24"/>
+        </w:rPr>
+        <w:t>Olist_</w:t>
+      </w:r>
+      <w:r>
+        <w:rPr>
+          <w:sz w:val="24"/>
+          <w:szCs w:val="24"/>
+        </w:rPr>
+        <w:t>products_dataset</w:t>
+      </w:r>
+      <w:proofErr w:type="spellEnd"/>
+      <w:r>
+        <w:rPr>
+          <w:sz w:val="24"/>
+          <w:szCs w:val="24"/>
+        </w:rPr>
+        <w:t xml:space="preserve"> contains columns </w:t>
+      </w:r>
+      <w:proofErr w:type="spellStart"/>
+      <w:r>
+        <w:rPr>
+          <w:sz w:val="24"/>
+          <w:szCs w:val="24"/>
+        </w:rPr>
+        <w:t>product_id</w:t>
+      </w:r>
+      <w:proofErr w:type="spellEnd"/>
+      <w:r>
+        <w:rPr>
+          <w:sz w:val="24"/>
+          <w:szCs w:val="24"/>
+        </w:rPr>
+        <w:t xml:space="preserve">, </w:t>
+      </w:r>
+      <w:proofErr w:type="spellStart"/>
+      <w:r>
+        <w:rPr>
+          <w:sz w:val="24"/>
+          <w:szCs w:val="24"/>
+        </w:rPr>
+        <w:t>product_category_name</w:t>
+      </w:r>
+      <w:proofErr w:type="spellEnd"/>
+      <w:r>
+        <w:rPr>
+          <w:sz w:val="24"/>
+          <w:szCs w:val="24"/>
+        </w:rPr>
+        <w:t xml:space="preserve">, </w:t>
+      </w:r>
+      <w:proofErr w:type="spellStart"/>
+      <w:r>
+        <w:rPr>
+          <w:sz w:val="24"/>
+          <w:szCs w:val="24"/>
+        </w:rPr>
+        <w:t>product_name_lenght</w:t>
+      </w:r>
+      <w:proofErr w:type="spellEnd"/>
+      <w:r>
+        <w:rPr>
+          <w:sz w:val="24"/>
+          <w:szCs w:val="24"/>
+        </w:rPr>
+        <w:t xml:space="preserve">, </w:t>
+      </w:r>
+      <w:proofErr w:type="spellStart"/>
+      <w:r>
+        <w:rPr>
+          <w:sz w:val="24"/>
+          <w:szCs w:val="24"/>
+        </w:rPr>
+        <w:t>product_description_lenght</w:t>
+      </w:r>
+      <w:proofErr w:type="spellEnd"/>
+      <w:r>
+        <w:rPr>
+          <w:sz w:val="24"/>
+          <w:szCs w:val="24"/>
+        </w:rPr>
+        <w:t xml:space="preserve">, </w:t>
+      </w:r>
+      <w:proofErr w:type="spellStart"/>
+      <w:r>
+        <w:rPr>
+          <w:sz w:val="24"/>
+          <w:szCs w:val="24"/>
+        </w:rPr>
+        <w:t>product_photos_qyt</w:t>
+      </w:r>
+      <w:proofErr w:type="spellEnd"/>
+      <w:r>
+        <w:rPr>
+          <w:sz w:val="24"/>
+          <w:szCs w:val="24"/>
+        </w:rPr>
+        <w:t>,</w:t>
+      </w:r>
+      <w:r>
+        <w:rPr>
+          <w:sz w:val="24"/>
+          <w:szCs w:val="24"/>
+        </w:rPr>
+        <w:t xml:space="preserve"> </w:t>
+      </w:r>
+      <w:proofErr w:type="spellStart"/>
+      <w:r>
+        <w:rPr>
+          <w:sz w:val="24"/>
+          <w:szCs w:val="24"/>
+        </w:rPr>
+        <w:t>product_weight_g</w:t>
+      </w:r>
+      <w:proofErr w:type="spellEnd"/>
+      <w:r>
+        <w:rPr>
+          <w:sz w:val="24"/>
+          <w:szCs w:val="24"/>
+        </w:rPr>
+        <w:t xml:space="preserve">, </w:t>
+      </w:r>
+      <w:proofErr w:type="spellStart"/>
+      <w:r>
+        <w:rPr>
+          <w:sz w:val="24"/>
+          <w:szCs w:val="24"/>
+        </w:rPr>
+        <w:t>product_lenght_cm</w:t>
+      </w:r>
+      <w:proofErr w:type="spellEnd"/>
+      <w:r>
+        <w:rPr>
+          <w:sz w:val="24"/>
+          <w:szCs w:val="24"/>
+        </w:rPr>
+        <w:t xml:space="preserve">, </w:t>
+      </w:r>
+      <w:proofErr w:type="spellStart"/>
+      <w:r>
+        <w:rPr>
+          <w:sz w:val="24"/>
+          <w:szCs w:val="24"/>
+        </w:rPr>
+        <w:t>product_height_cm</w:t>
+      </w:r>
+      <w:proofErr w:type="spellEnd"/>
+      <w:r>
+        <w:rPr>
+          <w:sz w:val="24"/>
+          <w:szCs w:val="24"/>
+        </w:rPr>
+        <w:t xml:space="preserve">, </w:t>
+      </w:r>
+      <w:proofErr w:type="spellStart"/>
+      <w:r>
+        <w:rPr>
+          <w:sz w:val="24"/>
+          <w:szCs w:val="24"/>
+        </w:rPr>
+        <w:t>product_width_cm</w:t>
+      </w:r>
+      <w:proofErr w:type="spellEnd"/>
+      <w:r>
+        <w:rPr>
+          <w:sz w:val="24"/>
+          <w:szCs w:val="24"/>
+        </w:rPr>
+        <w:t>.</w:t>
+      </w:r>
+    </w:p>
+    <w:p>
+      <w:pPr>
+        <w:pStyle w:val="ListParagraph"/>
+        <w:numPr>
+          <w:ilvl w:val="0"/>
+          <w:numId w:val="4"/>
+        </w:numPr>
+        <w:rPr>
+          <w:sz w:val="24"/>
+          <w:szCs w:val="24"/>
+        </w:rPr>
+      </w:pPr>
+      <w:proofErr w:type="spellStart"/>
+      <w:r>
+        <w:rPr>
+          <w:sz w:val="24"/>
+          <w:szCs w:val="24"/>
+        </w:rPr>
+        <w:t>Olist_customer_dataset</w:t>
+      </w:r>
+      <w:proofErr w:type="spellEnd"/>
+      <w:r>
+        <w:rPr>
+          <w:sz w:val="24"/>
+          <w:szCs w:val="24"/>
+        </w:rPr>
+        <w:t xml:space="preserve"> contains columns </w:t>
+      </w:r>
+    </w:p>
+    <w:p>
+      <w:pPr>
+        <w:rPr>
+          <w:sz w:val="24"/>
+          <w:szCs w:val="24"/>
+        </w:rPr>
       </w:pPr>
     </w:p>
     <w:p>
@@ -691,7 +1018,15 @@
         </w:numPr>
       </w:pPr>
       <w:r>
-        <w:t xml:space="preserve">Downloaded the Olist e-commerce dataset from Kaggle and extracted the files. </w:t>
+        <w:t xml:space="preserve">Downloaded the </w:t>
+      </w:r>
+      <w:proofErr w:type="spellStart"/>
+      <w:r>
+        <w:t>Olist</w:t>
+      </w:r>
+      <w:proofErr w:type="spellEnd"/>
+      <w:r>
+        <w:t xml:space="preserve"> e-commerce dataset from Kaggle and extracted the files. </w:t>
       </w:r>
     </w:p>
     <w:p>
@@ -942,12 +1277,21 @@
       <w:r>
         <w:t xml:space="preserve">Imported multiple datasets from the </w:t>
       </w:r>
+      <w:proofErr w:type="spellStart"/>
       <w:r>
         <w:rPr>
           <w:b/>
           <w:bCs/>
         </w:rPr>
-        <w:t>Olist E-commerce dataset</w:t>
+        <w:t>Olist</w:t>
+      </w:r>
+      <w:proofErr w:type="spellEnd"/>
+      <w:r>
+        <w:rPr>
+          <w:b/>
+          <w:bCs/>
+        </w:rPr>
+        <w:t xml:space="preserve"> E-commerce dataset</w:t>
       </w:r>
       <w:r>
         <w:t xml:space="preserve"> (stored locally), including: </w:t>
@@ -998,8 +1342,13 @@
           <w:numId w:val="11"/>
         </w:numPr>
       </w:pPr>
-      <w:r>
-        <w:t xml:space="preserve">order_items </w:t>
+      <w:proofErr w:type="spellStart"/>
+      <w:r>
+        <w:t>order_items</w:t>
+      </w:r>
+      <w:proofErr w:type="spellEnd"/>
+      <w:r>
+        <w:t xml:space="preserve"> </w:t>
       </w:r>
     </w:p>
     <w:p>
@@ -1034,8 +1383,13 @@
           <w:numId w:val="12"/>
         </w:numPr>
       </w:pPr>
-      <w:r>
-        <w:t xml:space="preserve">customer_id (customers ↔ orders) </w:t>
+      <w:proofErr w:type="spellStart"/>
+      <w:r>
+        <w:t>customer_id</w:t>
+      </w:r>
+      <w:proofErr w:type="spellEnd"/>
+      <w:r>
+        <w:t xml:space="preserve"> (customers ↔ orders) </w:t>
       </w:r>
     </w:p>
     <w:p>
@@ -1046,8 +1400,21 @@
           <w:numId w:val="12"/>
         </w:numPr>
       </w:pPr>
-      <w:r>
-        <w:t xml:space="preserve">order_id (orders ↔ payments / order_items) </w:t>
+      <w:proofErr w:type="spellStart"/>
+      <w:r>
+        <w:t>order_id</w:t>
+      </w:r>
+      <w:proofErr w:type="spellEnd"/>
+      <w:r>
+        <w:t xml:space="preserve"> (orders ↔ payments / </w:t>
+      </w:r>
+      <w:proofErr w:type="spellStart"/>
+      <w:r>
+        <w:t>order_items</w:t>
+      </w:r>
+      <w:proofErr w:type="spellEnd"/>
+      <w:r>
+        <w:t xml:space="preserve">) </w:t>
       </w:r>
     </w:p>
     <w:p>
@@ -1175,13 +1542,29 @@
         <w:t>perform</w:t>
       </w:r>
       <w:r>
-        <w:t xml:space="preserve"> SQl analysis of dataset </w:t>
-      </w:r>
-      <w:r>
-        <w:t xml:space="preserve">to identify business KPI’s and customer insights </w:t>
-      </w:r>
-      <w:r>
-        <w:t xml:space="preserve"> which are given below:</w:t>
+        <w:t xml:space="preserve"> </w:t>
+      </w:r>
+      <w:proofErr w:type="spellStart"/>
+      <w:r>
+        <w:t>SQl</w:t>
+      </w:r>
+      <w:proofErr w:type="spellEnd"/>
+      <w:r>
+        <w:t xml:space="preserve"> analysis of dataset </w:t>
+      </w:r>
+      <w:r>
+        <w:t xml:space="preserve">to identify business KPI’s and customer </w:t>
+      </w:r>
+      <w:proofErr w:type="gramStart"/>
+      <w:r>
+        <w:t xml:space="preserve">insights </w:t>
+      </w:r>
+      <w:r>
+        <w:t xml:space="preserve"> which</w:t>
+      </w:r>
+      <w:proofErr w:type="gramEnd"/>
+      <w:r>
+        <w:t xml:space="preserve"> are given below:</w:t>
       </w:r>
     </w:p>
     <w:p>
@@ -1211,7 +1594,15 @@
         </w:numPr>
       </w:pPr>
       <w:r>
-        <w:t>Total orders is ‘99441’.</w:t>
+        <w:t xml:space="preserve">Total orders </w:t>
+      </w:r>
+      <w:proofErr w:type="gramStart"/>
+      <w:r>
+        <w:t>is</w:t>
+      </w:r>
+      <w:proofErr w:type="gramEnd"/>
+      <w:r>
+        <w:t xml:space="preserve"> ‘99441’.</w:t>
       </w:r>
     </w:p>
     <w:p>
@@ -1223,7 +1614,15 @@
         </w:numPr>
       </w:pPr>
       <w:r>
-        <w:t>Total customers is 96096.</w:t>
+        <w:t xml:space="preserve">Total customers </w:t>
+      </w:r>
+      <w:proofErr w:type="gramStart"/>
+      <w:r>
+        <w:t>is</w:t>
+      </w:r>
+      <w:proofErr w:type="gramEnd"/>
+      <w:r>
+        <w:t xml:space="preserve"> 96096.</w:t>
       </w:r>
     </w:p>
     <w:p>
@@ -1572,6 +1971,32 @@
         <w:t>Create Visualization.</w:t>
       </w:r>
     </w:p>
+    <w:p>
+      <w:pPr>
+        <w:pStyle w:val="Heading2"/>
+        <w:rPr>
+          <w:color w:val="auto"/>
+        </w:rPr>
+      </w:pPr>
+      <w:r>
+        <w:t xml:space="preserve">Day 5 What I Did: </w:t>
+      </w:r>
+      <w:r>
+        <w:rPr>
+          <w:color w:val="auto"/>
+        </w:rPr>
+        <w:t>Create interactive dashboard using power BI.</w:t>
+      </w:r>
+    </w:p>
+    <w:p>
+      <w:pPr>
+        <w:pStyle w:val="ListParagraph"/>
+        <w:numPr>
+          <w:ilvl w:val="0"/>
+          <w:numId w:val="17"/>
+        </w:numPr>
+      </w:pPr>
+    </w:p>
     <w:sectPr>
       <w:pgSz w:w="12240" w:h="15840"/>
       <w:pgMar w:top="1440" w:right="1440" w:bottom="1440" w:left="1440" w:header="720" w:footer="720" w:gutter="0"/>
@@ -2908,6 +3333,119 @@
     </w:lvl>
   </w:abstractNum>
   <w:abstractNum w:abstractNumId="12" w15:restartNumberingAfterBreak="0">
+    <w:nsid w:val="5E082ADC"/>
+    <w:multiLevelType w:val="hybridMultilevel"/>
+    <w:tmpl w:val="D854977C"/>
+    <w:lvl w:ilvl="0" w:tplc="04090001">
+      <w:start w:val="1"/>
+      <w:numFmt w:val="bullet"/>
+      <w:lvlText w:val=""/>
+      <w:lvlJc w:val="left"/>
+      <w:pPr>
+        <w:ind w:left="720" w:hanging="360"/>
+      </w:pPr>
+      <w:rPr>
+        <w:rFonts w:ascii="Symbol" w:hAnsi="Symbol" w:hint="default"/>
+      </w:rPr>
+    </w:lvl>
+    <w:lvl w:ilvl="1" w:tplc="04090003" w:tentative="1">
+      <w:start w:val="1"/>
+      <w:numFmt w:val="bullet"/>
+      <w:lvlText w:val="o"/>
+      <w:lvlJc w:val="left"/>
+      <w:pPr>
+        <w:ind w:left="1440" w:hanging="360"/>
+      </w:pPr>
+      <w:rPr>
+        <w:rFonts w:ascii="Courier New" w:hAnsi="Courier New" w:cs="Courier New" w:hint="default"/>
+      </w:rPr>
+    </w:lvl>
+    <w:lvl w:ilvl="2" w:tplc="04090005" w:tentative="1">
+      <w:start w:val="1"/>
+      <w:numFmt w:val="bullet"/>
+      <w:lvlText w:val=""/>
+      <w:lvlJc w:val="left"/>
+      <w:pPr>
+        <w:ind w:left="2160" w:hanging="360"/>
+      </w:pPr>
+      <w:rPr>
+        <w:rFonts w:ascii="Wingdings" w:hAnsi="Wingdings" w:hint="default"/>
+      </w:rPr>
+    </w:lvl>
+    <w:lvl w:ilvl="3" w:tplc="04090001" w:tentative="1">
+      <w:start w:val="1"/>
+      <w:numFmt w:val="bullet"/>
+      <w:lvlText w:val=""/>
+      <w:lvlJc w:val="left"/>
+      <w:pPr>
+        <w:ind w:left="2880" w:hanging="360"/>
+      </w:pPr>
+      <w:rPr>
+        <w:rFonts w:ascii="Symbol" w:hAnsi="Symbol" w:hint="default"/>
+      </w:rPr>
+    </w:lvl>
+    <w:lvl w:ilvl="4" w:tplc="04090003" w:tentative="1">
+      <w:start w:val="1"/>
+      <w:numFmt w:val="bullet"/>
+      <w:lvlText w:val="o"/>
+      <w:lvlJc w:val="left"/>
+      <w:pPr>
+        <w:ind w:left="3600" w:hanging="360"/>
+      </w:pPr>
+      <w:rPr>
+        <w:rFonts w:ascii="Courier New" w:hAnsi="Courier New" w:cs="Courier New" w:hint="default"/>
+      </w:rPr>
+    </w:lvl>
+    <w:lvl w:ilvl="5" w:tplc="04090005" w:tentative="1">
+      <w:start w:val="1"/>
+      <w:numFmt w:val="bullet"/>
+      <w:lvlText w:val=""/>
+      <w:lvlJc w:val="left"/>
+      <w:pPr>
+        <w:ind w:left="4320" w:hanging="360"/>
+      </w:pPr>
+      <w:rPr>
+        <w:rFonts w:ascii="Wingdings" w:hAnsi="Wingdings" w:hint="default"/>
+      </w:rPr>
+    </w:lvl>
+    <w:lvl w:ilvl="6" w:tplc="04090001" w:tentative="1">
+      <w:start w:val="1"/>
+      <w:numFmt w:val="bullet"/>
+      <w:lvlText w:val=""/>
+      <w:lvlJc w:val="left"/>
+      <w:pPr>
+        <w:ind w:left="5040" w:hanging="360"/>
+      </w:pPr>
+      <w:rPr>
+        <w:rFonts w:ascii="Symbol" w:hAnsi="Symbol" w:hint="default"/>
+      </w:rPr>
+    </w:lvl>
+    <w:lvl w:ilvl="7" w:tplc="04090003" w:tentative="1">
+      <w:start w:val="1"/>
+      <w:numFmt w:val="bullet"/>
+      <w:lvlText w:val="o"/>
+      <w:lvlJc w:val="left"/>
+      <w:pPr>
+        <w:ind w:left="5760" w:hanging="360"/>
+      </w:pPr>
+      <w:rPr>
+        <w:rFonts w:ascii="Courier New" w:hAnsi="Courier New" w:cs="Courier New" w:hint="default"/>
+      </w:rPr>
+    </w:lvl>
+    <w:lvl w:ilvl="8" w:tplc="04090005" w:tentative="1">
+      <w:start w:val="1"/>
+      <w:numFmt w:val="bullet"/>
+      <w:lvlText w:val=""/>
+      <w:lvlJc w:val="left"/>
+      <w:pPr>
+        <w:ind w:left="6480" w:hanging="360"/>
+      </w:pPr>
+      <w:rPr>
+        <w:rFonts w:ascii="Wingdings" w:hAnsi="Wingdings" w:hint="default"/>
+      </w:rPr>
+    </w:lvl>
+  </w:abstractNum>
+  <w:abstractNum w:abstractNumId="13" w15:restartNumberingAfterBreak="0">
     <w:nsid w:val="652468BC"/>
     <w:multiLevelType w:val="hybridMultilevel"/>
     <w:tmpl w:val="7E82AA46"/>
@@ -3020,7 +3558,7 @@
       </w:rPr>
     </w:lvl>
   </w:abstractNum>
-  <w:abstractNum w:abstractNumId="13" w15:restartNumberingAfterBreak="0">
+  <w:abstractNum w:abstractNumId="14" w15:restartNumberingAfterBreak="0">
     <w:nsid w:val="73671137"/>
     <w:multiLevelType w:val="hybridMultilevel"/>
     <w:tmpl w:val="5198C30C"/>
@@ -3106,7 +3644,7 @@
       </w:pPr>
     </w:lvl>
   </w:abstractNum>
-  <w:abstractNum w:abstractNumId="14" w15:restartNumberingAfterBreak="0">
+  <w:abstractNum w:abstractNumId="15" w15:restartNumberingAfterBreak="0">
     <w:nsid w:val="74D85E35"/>
     <w:multiLevelType w:val="hybridMultilevel"/>
     <w:tmpl w:val="C3868154"/>
@@ -3192,7 +3730,7 @@
       </w:pPr>
     </w:lvl>
   </w:abstractNum>
-  <w:abstractNum w:abstractNumId="15" w15:restartNumberingAfterBreak="0">
+  <w:abstractNum w:abstractNumId="16" w15:restartNumberingAfterBreak="0">
     <w:nsid w:val="7AF72157"/>
     <w:multiLevelType w:val="multilevel"/>
     <w:tmpl w:val="9AD68A1E"/>
@@ -3354,7 +3892,7 @@
     <w:abstractNumId w:val="5"/>
   </w:num>
   <w:num w:numId="5" w16cid:durableId="1330718531">
-    <w:abstractNumId w:val="12"/>
+    <w:abstractNumId w:val="13"/>
   </w:num>
   <w:num w:numId="6" w16cid:durableId="644358138">
     <w:abstractNumId w:val="0"/>
@@ -3369,13 +3907,13 @@
     <w:abstractNumId w:val="6"/>
   </w:num>
   <w:num w:numId="10" w16cid:durableId="448620981">
-    <w:abstractNumId w:val="15"/>
+    <w:abstractNumId w:val="16"/>
   </w:num>
   <w:num w:numId="11" w16cid:durableId="1894928328">
-    <w:abstractNumId w:val="13"/>
+    <w:abstractNumId w:val="14"/>
   </w:num>
   <w:num w:numId="12" w16cid:durableId="937837565">
-    <w:abstractNumId w:val="14"/>
+    <w:abstractNumId w:val="15"/>
   </w:num>
   <w:num w:numId="13" w16cid:durableId="204948047">
     <w:abstractNumId w:val="2"/>
@@ -3388,6 +3926,9 @@
   </w:num>
   <w:num w:numId="16" w16cid:durableId="39405473">
     <w:abstractNumId w:val="7"/>
+  </w:num>
+  <w:num w:numId="17" w16cid:durableId="2099405512">
+    <w:abstractNumId w:val="12"/>
   </w:num>
 </w:numbering>
 </file>

</xml_diff>